<commit_message>
EP2 docs+GTM refresh to EP1-captured state
VALIDATED_RELEASE: EP1 fields flipped to captured (validation date, evidence link, full run table - posture/happy-path/VerificationHold/load/storm/canary/defect/teardown). README: new 'Validated evidence (EP1 live run)' section + honest not-yet-done list. GATE-B-CHECKLIST: B1-B6 rows -> EP1 live-proven, run header CAPTURED. GTM: customer+leadership deck stats/notes rebuilt on EP1 (137 tests, 10/10 concurrent, 0 PII hits, VerificationHold), regulatory doc evidence rows updated, 32-check references retired; decks+regulatory.docx regenerated. Suite 137/137.
</commit_message>
<xml_diff>
--- a/docs/Financial-Aid-AgentCore-Regulatory-Adherence.docx
+++ b/docs/Financial-Aid-AgentCore-Regulatory-Adherence.docx
@@ -2275,7 +2275,7 @@
                 <w:sz w:val="19"/>
                 <w:szCs w:val="19"/>
               </w:rPr>
-              <w:t xml:space="preserve">Reproducible, manifest-driven infrastructure-as-code and a 32-check governance test harness that runs in enforcement mode.</w:t>
+              <w:t xml:space="preserve">Reproducible, manifest-driven infrastructure-as-code and a 137-test automated suite gating every change in CI plus a captured clean-account live validation run (evidence/EP1-VALIDATION.md).</w:t>
             </w:r>
           </w:p>
         </w:tc>
@@ -2844,7 +2844,7 @@
                 <w:sz w:val="19"/>
                 <w:szCs w:val="19"/>
               </w:rPr>
-              <w:t xml:space="preserve">Reproducible IaC + the 32-check governance harness</w:t>
+              <w:t xml:space="preserve">Reproducible CDK IaC + the automated test suite + captured EP1 validation evidence</w:t>
             </w:r>
           </w:p>
         </w:tc>

</xml_diff>